<commit_message>
docs(epas): regenerate DOCX with chapter page breaks
</commit_message>
<xml_diff>
--- a/build/EPAS-v2.0-publication-draft.docx
+++ b/build/EPAS-v2.0-publication-draft.docx
@@ -2522,11 +2522,9 @@
       </w:r>
     </w:p>
     <w:p>
-      <w:r>
-        <w:pict>
-          <v:rect style="width:0;height:1.5pt" o:hralign="center" o:hrstd="t" o:hr="t"/>
-        </w:pict>
-      </w:r>
+      <w:pPr>
+        <w:pStyle w:val="BodyText"/>
+      </w:pPr>
     </w:p>
     <w:bookmarkEnd w:id="31"/>
     <w:bookmarkEnd w:id="32"/>
@@ -2547,6 +2545,11 @@
       <w:r>
         <w:t xml:space="preserve">Part I — Platform Foundation</w:t>
       </w:r>
+    </w:p>
+    <w:p>
+      <w:pPr>
+        <w:pStyle w:val="FirstParagraph"/>
+      </w:pPr>
     </w:p>
     <w:bookmarkEnd w:id="33"/>
     <w:bookmarkStart w:id="45" w:name="chapter-1-platform-vision"/>
@@ -3506,11 +3509,9 @@
       </w:r>
     </w:p>
     <w:p>
-      <w:r>
-        <w:pict>
-          <v:rect style="width:0;height:1.5pt" o:hralign="center" o:hrstd="t" o:hr="t"/>
-        </w:pict>
-      </w:r>
+      <w:pPr>
+        <w:pStyle w:val="BodyText"/>
+      </w:pPr>
     </w:p>
     <w:bookmarkEnd w:id="44"/>
     <w:bookmarkEnd w:id="45"/>
@@ -4645,11 +4646,9 @@
       </w:r>
     </w:p>
     <w:p>
-      <w:r>
-        <w:pict>
-          <v:rect style="width:0;height:1.5pt" o:hralign="center" o:hrstd="t" o:hr="t"/>
-        </w:pict>
-      </w:r>
+      <w:pPr>
+        <w:pStyle w:val="BodyText"/>
+      </w:pPr>
     </w:p>
     <w:bookmarkEnd w:id="59"/>
     <w:bookmarkEnd w:id="60"/>
@@ -6341,11 +6340,9 @@
       </w:r>
     </w:p>
     <w:p>
-      <w:r>
-        <w:pict>
-          <v:rect style="width:0;height:1.5pt" o:hralign="center" o:hrstd="t" o:hr="t"/>
-        </w:pict>
-      </w:r>
+      <w:pPr>
+        <w:pStyle w:val="BodyText"/>
+      </w:pPr>
     </w:p>
     <w:bookmarkEnd w:id="75"/>
     <w:bookmarkEnd w:id="76"/>
@@ -8083,11 +8080,9 @@
       </w:r>
     </w:p>
     <w:p>
-      <w:r>
-        <w:pict>
-          <v:rect style="width:0;height:1.5pt" o:hralign="center" o:hrstd="t" o:hr="t"/>
-        </w:pict>
-      </w:r>
+      <w:pPr>
+        <w:pStyle w:val="BodyText"/>
+      </w:pPr>
     </w:p>
     <w:bookmarkEnd w:id="94"/>
     <w:bookmarkEnd w:id="95"/>
@@ -10069,11 +10064,9 @@
       </w:r>
     </w:p>
     <w:p>
-      <w:r>
-        <w:pict>
-          <v:rect style="width:0;height:1.5pt" o:hralign="center" o:hrstd="t" o:hr="t"/>
-        </w:pict>
-      </w:r>
+      <w:pPr>
+        <w:pStyle w:val="BodyText"/>
+      </w:pPr>
     </w:p>
     <w:bookmarkEnd w:id="113"/>
     <w:bookmarkEnd w:id="114"/>
@@ -12277,11 +12270,9 @@
       </w:r>
     </w:p>
     <w:p>
-      <w:r>
-        <w:pict>
-          <v:rect style="width:0;height:1.5pt" o:hralign="center" o:hrstd="t" o:hr="t"/>
-        </w:pict>
-      </w:r>
+      <w:pPr>
+        <w:pStyle w:val="FirstParagraph"/>
+      </w:pPr>
     </w:p>
     <w:bookmarkEnd w:id="133"/>
     <w:bookmarkEnd w:id="134"/>
@@ -12304,11 +12295,9 @@
       </w:r>
     </w:p>
     <w:p>
-      <w:r>
-        <w:pict>
-          <v:rect style="width:0;height:1.5pt" o:hralign="center" o:hrstd="t" o:hr="t"/>
-        </w:pict>
-      </w:r>
+      <w:pPr>
+        <w:pStyle w:val="FirstParagraph"/>
+      </w:pPr>
     </w:p>
     <w:bookmarkEnd w:id="135"/>
     <w:bookmarkStart w:id="156" w:name="chapter-7-custody-governance"/>
@@ -14666,11 +14655,9 @@
       </w:r>
     </w:p>
     <w:p>
-      <w:r>
-        <w:pict>
-          <v:rect style="width:0;height:1.5pt" o:hralign="center" o:hrstd="t" o:hr="t"/>
-        </w:pict>
-      </w:r>
+      <w:pPr>
+        <w:pStyle w:val="BodyText"/>
+      </w:pPr>
     </w:p>
     <w:bookmarkEnd w:id="155"/>
     <w:bookmarkEnd w:id="156"/>
@@ -16937,11 +16924,9 @@
       </w:r>
     </w:p>
     <w:p>
-      <w:r>
-        <w:pict>
-          <v:rect style="width:0;height:1.5pt" o:hralign="center" o:hrstd="t" o:hr="t"/>
-        </w:pict>
-      </w:r>
+      <w:pPr>
+        <w:pStyle w:val="BodyText"/>
+      </w:pPr>
     </w:p>
     <w:bookmarkEnd w:id="175"/>
     <w:bookmarkEnd w:id="176"/>
@@ -18947,11 +18932,9 @@
       </w:r>
     </w:p>
     <w:p>
-      <w:r>
-        <w:pict>
-          <v:rect style="width:0;height:1.5pt" o:hralign="center" o:hrstd="t" o:hr="t"/>
-        </w:pict>
-      </w:r>
+      <w:pPr>
+        <w:pStyle w:val="BodyText"/>
+      </w:pPr>
     </w:p>
     <w:bookmarkEnd w:id="196"/>
     <w:bookmarkEnd w:id="197"/>
@@ -20825,11 +20808,9 @@
       </w:r>
     </w:p>
     <w:p>
-      <w:r>
-        <w:pict>
-          <v:rect style="width:0;height:1.5pt" o:hralign="center" o:hrstd="t" o:hr="t"/>
-        </w:pict>
-      </w:r>
+      <w:pPr>
+        <w:pStyle w:val="BodyText"/>
+      </w:pPr>
     </w:p>
     <w:bookmarkEnd w:id="217"/>
     <w:bookmarkEnd w:id="218"/>
@@ -22747,11 +22728,9 @@
       </w:r>
     </w:p>
     <w:p>
-      <w:r>
-        <w:pict>
-          <v:rect style="width:0;height:1.5pt" o:hralign="center" o:hrstd="t" o:hr="t"/>
-        </w:pict>
-      </w:r>
+      <w:pPr>
+        <w:pStyle w:val="BodyText"/>
+      </w:pPr>
     </w:p>
     <w:bookmarkEnd w:id="238"/>
     <w:bookmarkEnd w:id="239"/>
@@ -22774,11 +22753,9 @@
       </w:r>
     </w:p>
     <w:p>
-      <w:r>
-        <w:pict>
-          <v:rect style="width:0;height:1.5pt" o:hralign="center" o:hrstd="t" o:hr="t"/>
-        </w:pict>
-      </w:r>
+      <w:pPr>
+        <w:pStyle w:val="FirstParagraph"/>
+      </w:pPr>
     </w:p>
     <w:bookmarkEnd w:id="240"/>
     <w:bookmarkStart w:id="261" w:name="chapter-12-cross-cutting-services"/>
@@ -24539,11 +24516,9 @@
       </w:r>
     </w:p>
     <w:p>
-      <w:r>
-        <w:pict>
-          <v:rect style="width:0;height:1.5pt" o:hralign="center" o:hrstd="t" o:hr="t"/>
-        </w:pict>
-      </w:r>
+      <w:pPr>
+        <w:pStyle w:val="BodyText"/>
+      </w:pPr>
     </w:p>
     <w:bookmarkEnd w:id="260"/>
     <w:bookmarkEnd w:id="261"/>
@@ -26206,11 +26181,9 @@
       </w:r>
     </w:p>
     <w:p>
-      <w:r>
-        <w:pict>
-          <v:rect style="width:0;height:1.5pt" o:hralign="center" o:hrstd="t" o:hr="t"/>
-        </w:pict>
-      </w:r>
+      <w:pPr>
+        <w:pStyle w:val="BodyText"/>
+      </w:pPr>
     </w:p>
     <w:bookmarkEnd w:id="280"/>
     <w:bookmarkEnd w:id="281"/>
@@ -27899,11 +27872,9 @@
       </w:r>
     </w:p>
     <w:p>
-      <w:r>
-        <w:pict>
-          <v:rect style="width:0;height:1.5pt" o:hralign="center" o:hrstd="t" o:hr="t"/>
-        </w:pict>
-      </w:r>
+      <w:pPr>
+        <w:pStyle w:val="BodyText"/>
+      </w:pPr>
     </w:p>
     <w:bookmarkEnd w:id="300"/>
     <w:bookmarkEnd w:id="301"/>
@@ -29754,11 +29725,9 @@
       </w:r>
     </w:p>
     <w:p>
-      <w:r>
-        <w:pict>
-          <v:rect style="width:0;height:1.5pt" o:hralign="center" o:hrstd="t" o:hr="t"/>
-        </w:pict>
-      </w:r>
+      <w:pPr>
+        <w:pStyle w:val="BodyText"/>
+      </w:pPr>
     </w:p>
     <w:bookmarkEnd w:id="320"/>
     <w:bookmarkEnd w:id="321"/>
@@ -31066,11 +31035,9 @@
       </w:r>
     </w:p>
     <w:p>
-      <w:r>
-        <w:pict>
-          <v:rect style="width:0;height:1.5pt" o:hralign="center" o:hrstd="t" o:hr="t"/>
-        </w:pict>
-      </w:r>
+      <w:pPr>
+        <w:pStyle w:val="BodyText"/>
+      </w:pPr>
     </w:p>
     <w:bookmarkEnd w:id="339"/>
     <w:bookmarkEnd w:id="340"/>
@@ -31093,11 +31060,9 @@
       </w:r>
     </w:p>
     <w:p>
-      <w:r>
-        <w:pict>
-          <v:rect style="width:0;height:1.5pt" o:hralign="center" o:hrstd="t" o:hr="t"/>
-        </w:pict>
-      </w:r>
+      <w:pPr>
+        <w:pStyle w:val="FirstParagraph"/>
+      </w:pPr>
     </w:p>
     <w:bookmarkEnd w:id="341"/>
     <w:bookmarkStart w:id="362" w:name="chapter-17-future-platform-evolution"/>
@@ -32570,11 +32535,9 @@
       </w:r>
     </w:p>
     <w:p>
-      <w:r>
-        <w:pict>
-          <v:rect style="width:0;height:1.5pt" o:hralign="center" o:hrstd="t" o:hr="t"/>
-        </w:pict>
-      </w:r>
+      <w:pPr>
+        <w:pStyle w:val="BodyText"/>
+      </w:pPr>
     </w:p>
     <w:bookmarkEnd w:id="361"/>
     <w:bookmarkEnd w:id="362"/>
@@ -33914,11 +33877,9 @@
       </w:r>
     </w:p>
     <w:p>
-      <w:r>
-        <w:pict>
-          <v:rect style="width:0;height:1.5pt" o:hralign="center" o:hrstd="t" o:hr="t"/>
-        </w:pict>
-      </w:r>
+      <w:pPr>
+        <w:pStyle w:val="BodyText"/>
+      </w:pPr>
     </w:p>
     <w:bookmarkEnd w:id="380"/>
     <w:bookmarkEnd w:id="381"/>

</xml_diff>

<commit_message>
docs(epas): regenerate DOCX with front matter page breaks
</commit_message>
<xml_diff>
--- a/build/EPAS-v2.0-publication-draft.docx
+++ b/build/EPAS-v2.0-publication-draft.docx
@@ -1091,11 +1091,9 @@
       </w:r>
     </w:p>
     <w:p>
-      <w:r>
-        <w:pict>
-          <v:rect style="width:0;height:1.5pt" o:hralign="center" o:hrstd="t" o:hr="t"/>
-        </w:pict>
-      </w:r>
+      <w:pPr>
+        <w:pStyle w:val="FirstParagraph"/>
+      </w:pPr>
     </w:p>
     <w:bookmarkEnd w:id="24"/>
     <w:bookmarkStart w:id="26" w:name="executive-summary"/>
@@ -1379,11 +1377,9 @@
       </w:r>
     </w:p>
     <w:p>
-      <w:r>
-        <w:pict>
-          <v:rect style="width:0;height:1.5pt" o:hralign="center" o:hrstd="t" o:hr="t"/>
-        </w:pict>
-      </w:r>
+      <w:pPr>
+        <w:pStyle w:val="FirstParagraph"/>
+      </w:pPr>
     </w:p>
     <w:bookmarkEnd w:id="25"/>
     <w:bookmarkEnd w:id="26"/>
@@ -2423,11 +2419,9 @@
       </w:tr>
     </w:tbl>
     <w:p>
-      <w:r>
-        <w:pict>
-          <v:rect style="width:0;height:1.5pt" o:hralign="center" o:hrstd="t" o:hr="t"/>
-        </w:pict>
-      </w:r>
+      <w:pPr>
+        <w:pStyle w:val="BodyText"/>
+      </w:pPr>
     </w:p>
     <w:bookmarkEnd w:id="27"/>
     <w:bookmarkStart w:id="31" w:name="figure-1-edge-platform-context-model"/>

</xml_diff>